<commit_message>
fix(gr): modification instance project description
</commit_message>
<xml_diff>
--- a/document-merge-service/kt_gr/templatefiles/eingabequittung_it.docx
+++ b/document-merge-service/kt_gr/templatefiles/eingabequittung_it.docx
@@ -1,6 +1,6 @@
 
 <file path=word/document.xml><?xml version="1.0" encoding="utf-8"?>
-<w:document xmlns:o="urn:schemas-microsoft-com:office:office" xmlns:r="http://schemas.openxmlformats.org/officeDocument/2006/relationships" xmlns:v="urn:schemas-microsoft-com:vml" xmlns:w="http://schemas.openxmlformats.org/wordprocessingml/2006/main" xmlns:w10="urn:schemas-microsoft-com:office:word" xmlns:wp="http://schemas.openxmlformats.org/drawingml/2006/wordprocessingDrawing" xmlns:wps="http://schemas.microsoft.com/office/word/2010/wordprocessingShape" xmlns:wpg="http://schemas.microsoft.com/office/word/2010/wordprocessingGroup" xmlns:mc="http://schemas.openxmlformats.org/markup-compatibility/2006" xmlns:wp14="http://schemas.microsoft.com/office/word/2010/wordprocessingDrawing" xmlns:w14="http://schemas.microsoft.com/office/word/2010/wordml" xmlns:w15="http://schemas.microsoft.com/office/word/2012/wordml" mc:Ignorable="w14 wp14 w15">
+<w:document xmlns:o="urn:schemas-microsoft-com:office:office" xmlns:r="http://schemas.openxmlformats.org/officeDocument/2006/relationships" xmlns:v="urn:schemas-microsoft-com:vml" xmlns:w="http://schemas.openxmlformats.org/wordprocessingml/2006/main" xmlns:w10="urn:schemas-microsoft-com:office:word" xmlns:wp="http://schemas.openxmlformats.org/drawingml/2006/wordprocessingDrawing" xmlns:pic="http://schemas.openxmlformats.org/drawingml/2006/picture" xmlns:wps="http://schemas.microsoft.com/office/word/2010/wordprocessingShape" xmlns:wpg="http://schemas.microsoft.com/office/word/2010/wordprocessingGroup" xmlns:mc="http://schemas.openxmlformats.org/markup-compatibility/2006" xmlns:wp14="http://schemas.microsoft.com/office/word/2010/wordprocessingDrawing" xmlns:w14="http://schemas.microsoft.com/office/word/2010/wordml" xmlns:w15="http://schemas.microsoft.com/office/word/2012/wordml" mc:Ignorable="w14 wp14 w15">
   <w:body>
     <w:p>
       <w:pPr>
@@ -10,8 +10,9 @@
         </w:rPr>
       </w:pPr>
       <w:r>
+        <w:rPr/>
         <w:drawing>
-          <wp:anchor behindDoc="1" distT="0" distB="0" distL="0" distR="0" simplePos="0" locked="0" layoutInCell="0" allowOverlap="1" relativeHeight="2">
+          <wp:anchor behindDoc="1" distT="0" distB="0" distL="0" distR="0" simplePos="0" locked="0" layoutInCell="1" allowOverlap="1" relativeHeight="2">
             <wp:simplePos x="0" y="0"/>
             <wp:positionH relativeFrom="column">
               <wp:posOffset>45085</wp:posOffset>
@@ -49,6 +50,7 @@
                     <a:prstGeom prst="rect">
                       <a:avLst/>
                     </a:prstGeom>
+                    <a:noFill/>
                   </pic:spPr>
                 </pic:pic>
               </a:graphicData>
@@ -170,51 +172,53 @@
         <w:rPr>
           <w:sz w:val="40"/>
         </w:rPr>
-        <w:t xml:space="preserve">{{ caseType }}</w:t>
-      </w:r>
-    </w:p>
-    <w:p>
-      <w:pPr>
-        <w:pStyle w:val="Normal"/>
-        <w:rPr>
-          <w:rFonts w:ascii="Arial" w:hAnsi="Arial"/>
-        </w:rPr>
-      </w:pPr>
-      <w:r>
-        <w:rPr/>
-      </w:r>
-    </w:p>
-    <w:p>
-      <w:pPr>
-        <w:pStyle w:val="Normal"/>
-        <w:rPr>
-          <w:rFonts w:ascii="Arial" w:hAnsi="Arial"/>
-        </w:rPr>
-      </w:pPr>
-      <w:r>
-        <w:t xml:space="preserve">N. dossier {{ dossierNr }}</w:t>
-      </w:r>
-    </w:p>
-    <w:p>
-      <w:pPr>
-        <w:pStyle w:val="Normal"/>
-        <w:rPr>
-          <w:rFonts w:ascii="Arial" w:hAnsi="Arial"/>
-        </w:rPr>
-      </w:pPr>
-      <w:r>
-        <w:rPr/>
-      </w:r>
-    </w:p>
-    <w:p>
-      <w:pPr>
-        <w:pStyle w:val="Normal"/>
-        <w:rPr>
-          <w:rFonts w:ascii="Arial" w:hAnsi="Arial"/>
-        </w:rPr>
-      </w:pPr>
-      <w:r>
-        <w:t xml:space="preserve">{% if applicants %}</w:t>
+        <w:t>{{ caseType }}</w:t>
+      </w:r>
+    </w:p>
+    <w:p>
+      <w:pPr>
+        <w:pStyle w:val="Normal"/>
+        <w:rPr>
+          <w:rFonts w:ascii="Arial" w:hAnsi="Arial"/>
+        </w:rPr>
+      </w:pPr>
+      <w:r>
+        <w:rPr/>
+      </w:r>
+    </w:p>
+    <w:p>
+      <w:pPr>
+        <w:pStyle w:val="Normal"/>
+        <w:rPr>
+          <w:rFonts w:ascii="Arial" w:hAnsi="Arial"/>
+        </w:rPr>
+      </w:pPr>
+      <w:r>
+        <w:rPr/>
+        <w:t>N. dossier {{ dossierNr }}</w:t>
+      </w:r>
+    </w:p>
+    <w:p>
+      <w:pPr>
+        <w:pStyle w:val="Normal"/>
+        <w:rPr>
+          <w:rFonts w:ascii="Arial" w:hAnsi="Arial"/>
+        </w:rPr>
+      </w:pPr>
+      <w:r>
+        <w:rPr/>
+      </w:r>
+    </w:p>
+    <w:p>
+      <w:pPr>
+        <w:pStyle w:val="Normal"/>
+        <w:rPr>
+          <w:rFonts w:ascii="Arial" w:hAnsi="Arial"/>
+        </w:rPr>
+      </w:pPr>
+      <w:r>
+        <w:rPr/>
+        <w:t>{% if applicants %}</w:t>
       </w:r>
     </w:p>
     <w:p>
@@ -229,7 +233,7 @@
           <w:b/>
           <w:sz w:val="30"/>
         </w:rPr>
-        <w:t xml:space="preserve">{{ applicantHeaderLabel }}</w:t>
+        <w:t>{{ applicantHeaderLabel }}</w:t>
       </w:r>
     </w:p>
     <w:p>
@@ -267,7 +271,7 @@
         <w:rPr>
           <w:sz w:val="21"/>
         </w:rPr>
-        <w:t xml:space="preserve">{% for applicant in applicants %}</w:t>
+        <w:t>{% for applicant in applicants %}</w:t>
       </w:r>
     </w:p>
     <w:p>
@@ -285,19 +289,9 @@
         <w:rPr>
           <w:sz w:val="21"/>
         </w:rPr>
-        <w:t xml:space="preserve">{{ applicant.full_name }}</w:t>
-      </w:r>
-      <w:r>
-        <w:rPr>
-          <w:sz w:val="21"/>
-        </w:rPr>
+        <w:t>{{ applicant.full_name }}</w:t>
         <w:tab/>
-      </w:r>
-      <w:r>
-        <w:rPr>
-          <w:sz w:val="21"/>
-        </w:rPr>
-        <w:t xml:space="preserve">{{ applicant.tel }}</w:t>
+        <w:t>{{ applicant.tel }}</w:t>
       </w:r>
     </w:p>
     <w:p>
@@ -315,19 +309,9 @@
         <w:rPr>
           <w:sz w:val="21"/>
         </w:rPr>
-        <w:t xml:space="preserve">{{ applicant.street }} {{ applicant.street_number }}</w:t>
-      </w:r>
-      <w:r>
-        <w:rPr>
-          <w:sz w:val="21"/>
-        </w:rPr>
+        <w:t>{{ applicant.street }} {{ applicant.street_number }}</w:t>
         <w:tab/>
-      </w:r>
-      <w:r>
-        <w:rPr>
-          <w:sz w:val="21"/>
-        </w:rPr>
-        <w:t xml:space="preserve">{{ applicant.email }}</w:t>
+        <w:t>{{ applicant.email }}</w:t>
       </w:r>
     </w:p>
     <w:p>
@@ -345,7 +329,7 @@
         <w:rPr>
           <w:sz w:val="21"/>
         </w:rPr>
-        <w:t xml:space="preserve">{{ applicant.zip}} {{applicant.town }}</w:t>
+        <w:t>{{ applicant.zip}} {{applicant.town }}</w:t>
       </w:r>
     </w:p>
     <w:p>
@@ -363,7 +347,7 @@
         <w:rPr>
           <w:sz w:val="21"/>
         </w:rPr>
-        <w:t xml:space="preserve">{% endfor %}</w:t>
+        <w:t>{% endfor %}</w:t>
       </w:r>
     </w:p>
     <w:p>
@@ -401,13 +385,13 @@
         <w:rPr>
           <w:sz w:val="22"/>
         </w:rPr>
-        <w:t xml:space="preserve">{% endif %}</w:t>
-      </w:r>
-      <w:r>
-        <w:rPr>
-          <w:sz w:val="21"/>
-        </w:rPr>
-        <w:t xml:space="preserve">{% if landowners %}</w:t>
+        <w:t>{% endif %}</w:t>
+      </w:r>
+      <w:r>
+        <w:rPr>
+          <w:sz w:val="21"/>
+        </w:rPr>
+        <w:t>{% if landowners %}</w:t>
       </w:r>
     </w:p>
     <w:p>
@@ -422,7 +406,7 @@
           <w:b/>
           <w:sz w:val="30"/>
         </w:rPr>
-        <w:t xml:space="preserve">{{ landownerHeaderLabel }}</w:t>
+        <w:t>{{ landownerHeaderLabel }}</w:t>
       </w:r>
     </w:p>
     <w:p>
@@ -451,15 +435,24 @@
         <w:fldChar w:fldCharType="begin"/>
       </w:r>
       <w:r>
+        <w:rPr/>
         <w:instrText xml:space="preserve">Test</w:instrText>
       </w:r>
-      <w:r/>
-      <w:r>
+      <w:r>
+        <w:rPr/>
+      </w:r>
+      <w:r>
+        <w:rPr/>
         <w:fldChar w:fldCharType="separate"/>
       </w:r>
-      <w:r/>
-      <w:r/>
-      <w:r>
+      <w:r>
+        <w:rPr/>
+      </w:r>
+      <w:r>
+        <w:rPr/>
+      </w:r>
+      <w:r>
+        <w:rPr/>
         <w:fldChar w:fldCharType="end"/>
       </w:r>
       <w:r>
@@ -502,7 +495,7 @@
         <w:rPr>
           <w:sz w:val="21"/>
         </w:rPr>
-        <w:t xml:space="preserve">{% for landowner in landowners %}</w:t>
+        <w:t>{% for landowner in landowners %}</w:t>
       </w:r>
     </w:p>
     <w:p>
@@ -520,19 +513,9 @@
         <w:rPr>
           <w:sz w:val="21"/>
         </w:rPr>
-        <w:t xml:space="preserve">{{ landowner.full_name }}</w:t>
-      </w:r>
-      <w:r>
-        <w:rPr>
-          <w:sz w:val="21"/>
-        </w:rPr>
+        <w:t>{{ landowner.full_name }}</w:t>
         <w:tab/>
-      </w:r>
-      <w:r>
-        <w:rPr>
-          <w:sz w:val="21"/>
-        </w:rPr>
-        <w:t xml:space="preserve">{{ landowner.tel }}</w:t>
+        <w:t>{{ landowner.tel }}</w:t>
       </w:r>
     </w:p>
     <w:p>
@@ -550,19 +533,9 @@
         <w:rPr>
           <w:sz w:val="21"/>
         </w:rPr>
-        <w:t xml:space="preserve">{{ landowner.street }} {{ landowner.street_number }}</w:t>
-      </w:r>
-      <w:r>
-        <w:rPr>
-          <w:sz w:val="21"/>
-        </w:rPr>
+        <w:t>{{ landowner.street }} {{ landowner.street_number }}</w:t>
         <w:tab/>
-      </w:r>
-      <w:r>
-        <w:rPr>
-          <w:sz w:val="21"/>
-        </w:rPr>
-        <w:t xml:space="preserve">{{ landowner.email }}</w:t>
+        <w:t>{{ landowner.email }}</w:t>
       </w:r>
     </w:p>
     <w:p>
@@ -580,7 +553,7 @@
         <w:rPr>
           <w:sz w:val="21"/>
         </w:rPr>
-        <w:t xml:space="preserve">{{ landowner.zip}} {{landowner.town }}</w:t>
+        <w:t>{{ landowner.zip}} {{landowner.town }}</w:t>
       </w:r>
     </w:p>
     <w:p>
@@ -598,7 +571,7 @@
         <w:rPr>
           <w:sz w:val="21"/>
         </w:rPr>
-        <w:t xml:space="preserve">{% endfor %}</w:t>
+        <w:t>{% endfor %}</w:t>
       </w:r>
     </w:p>
     <w:p>
@@ -636,7 +609,7 @@
         <w:rPr>
           <w:sz w:val="21"/>
         </w:rPr>
-        <w:t xml:space="preserve">{% endif %}{% if projectAuthors %}</w:t>
+        <w:t>{% endif %}{% if projectAuthors %}</w:t>
       </w:r>
     </w:p>
     <w:p>
@@ -651,7 +624,7 @@
           <w:b/>
           <w:sz w:val="30"/>
         </w:rPr>
-        <w:t xml:space="preserve">{{ projectAuthorHeaderLabel }}</w:t>
+        <w:t>{{ projectAuthorHeaderLabel }}</w:t>
       </w:r>
     </w:p>
     <w:p>
@@ -680,15 +653,24 @@
         <w:fldChar w:fldCharType="begin"/>
       </w:r>
       <w:r>
+        <w:rPr/>
         <w:instrText xml:space="preserve">Test</w:instrText>
       </w:r>
-      <w:r/>
-      <w:r>
+      <w:r>
+        <w:rPr/>
+      </w:r>
+      <w:r>
+        <w:rPr/>
         <w:fldChar w:fldCharType="separate"/>
       </w:r>
-      <w:r/>
-      <w:r/>
-      <w:r>
+      <w:r>
+        <w:rPr/>
+      </w:r>
+      <w:r>
+        <w:rPr/>
+      </w:r>
+      <w:r>
+        <w:rPr/>
         <w:fldChar w:fldCharType="end"/>
       </w:r>
       <w:r>
@@ -767,7 +749,7 @@
         <w:rPr>
           <w:sz w:val="21"/>
         </w:rPr>
-        <w:t xml:space="preserve">{% for projectAuthor in projectAuthors %}</w:t>
+        <w:t>{% for projectAuthor in projectAuthors %}</w:t>
       </w:r>
     </w:p>
     <w:p>
@@ -785,19 +767,9 @@
         <w:rPr>
           <w:sz w:val="21"/>
         </w:rPr>
-        <w:t xml:space="preserve">{{ projectAuthor.full_name }}</w:t>
-      </w:r>
-      <w:r>
-        <w:rPr>
-          <w:sz w:val="21"/>
-        </w:rPr>
+        <w:t>{{ projectAuthor.full_name }}</w:t>
         <w:tab/>
-      </w:r>
-      <w:r>
-        <w:rPr>
-          <w:sz w:val="21"/>
-        </w:rPr>
-        <w:t xml:space="preserve">{{ projectAuthor.tel }}</w:t>
+        <w:t>{{ projectAuthor.tel }}</w:t>
       </w:r>
     </w:p>
     <w:p>
@@ -815,19 +787,9 @@
         <w:rPr>
           <w:sz w:val="21"/>
         </w:rPr>
-        <w:t xml:space="preserve">{{ projectAuthor.street }} {{ projectAuthor.street_number }}</w:t>
-      </w:r>
-      <w:r>
-        <w:rPr>
-          <w:sz w:val="21"/>
-        </w:rPr>
+        <w:t>{{ projectAuthor.street }} {{ projectAuthor.street_number }}</w:t>
         <w:tab/>
-      </w:r>
-      <w:r>
-        <w:rPr>
-          <w:sz w:val="21"/>
-        </w:rPr>
-        <w:t xml:space="preserve">{{ projectAuthor.email }}</w:t>
+        <w:t>{{ projectAuthor.email }}</w:t>
       </w:r>
     </w:p>
     <w:p>
@@ -845,7 +807,7 @@
         <w:rPr>
           <w:sz w:val="21"/>
         </w:rPr>
-        <w:t xml:space="preserve">{{ projectAuthor.zip}} {{projectAuthor.town }}</w:t>
+        <w:t>{{ projectAuthor.zip}} {{projectAuthor.town }}</w:t>
       </w:r>
     </w:p>
     <w:p>
@@ -863,7 +825,7 @@
         <w:rPr>
           <w:sz w:val="21"/>
         </w:rPr>
-        <w:t xml:space="preserve">{% endfor %}</w:t>
+        <w:t>{% endfor %}</w:t>
       </w:r>
     </w:p>
     <w:p>
@@ -894,7 +856,8 @@
         </w:rPr>
       </w:pPr>
       <w:r>
-        <w:t xml:space="preserve">{% endif %}</w:t>
+        <w:rPr/>
+        <w:t>{% endif %}</w:t>
       </w:r>
     </w:p>
     <w:p>
@@ -909,7 +872,7 @@
           <w:b/>
           <w:sz w:val="30"/>
         </w:rPr>
-        <w:t xml:space="preserve">Domanda</w:t>
+        <w:t>Domanda</w:t>
       </w:r>
     </w:p>
     <w:p>
@@ -938,37 +901,49 @@
         <w:rPr>
           <w:b/>
         </w:rPr>
-        <w:t xml:space="preserve">Nome</w:t>
-      </w:r>
-      <w:r>
+        <w:t>Nome</w:t>
+      </w:r>
+      <w:r>
+        <w:rPr/>
         <w:t xml:space="preserve"> </w:t>
       </w:r>
       <w:r>
         <w:rPr>
           <w:b/>
         </w:rPr>
-        <w:t xml:space="preserve">progetto</w:t>
-      </w:r>
-      <w:r>
+        <w:t>progetto</w:t>
+      </w:r>
+      <w:r>
+        <w:rPr/>
         <w:tab/>
       </w:r>
       <w:r>
         <w:fldChar w:fldCharType="begin"/>
       </w:r>
       <w:r>
+        <w:rPr/>
         <w:instrText xml:space="preserve">Test</w:instrText>
       </w:r>
-      <w:r/>
-      <w:r>
+      <w:r>
+        <w:rPr/>
+      </w:r>
+      <w:r>
+        <w:rPr/>
         <w:fldChar w:fldCharType="separate"/>
       </w:r>
-      <w:r/>
-      <w:r/>
-      <w:r>
+      <w:r>
+        <w:rPr/>
+      </w:r>
+      <w:r>
+        <w:rPr/>
+      </w:r>
+      <w:r>
+        <w:rPr/>
         <w:fldChar w:fldCharType="end"/>
       </w:r>
       <w:r>
-        <w:t xml:space="preserve">{% if descriptionHeader %}{{ descriptionHeader}}{% else %}-{% endif %}</w:t>
+        <w:rPr/>
+        <w:t>{% if modificationHeader %}{{ modificationHeader}}{% elif descriptionHeader %}{{ descriptionHeader}}{% else %}-{% endif %}</w:t>
       </w:r>
     </w:p>
     <w:p>
@@ -1001,28 +976,39 @@
         <w:rPr>
           <w:b/>
         </w:rPr>
-        <w:t xml:space="preserve">Comune</w:t>
-      </w:r>
-      <w:r>
+        <w:t>Comune</w:t>
+      </w:r>
+      <w:r>
+        <w:rPr/>
         <w:tab/>
       </w:r>
       <w:r>
         <w:fldChar w:fldCharType="begin"/>
       </w:r>
       <w:r>
+        <w:rPr/>
         <w:instrText xml:space="preserve">Test</w:instrText>
       </w:r>
-      <w:r/>
-      <w:r>
+      <w:r>
+        <w:rPr/>
+      </w:r>
+      <w:r>
+        <w:rPr/>
         <w:fldChar w:fldCharType="separate"/>
       </w:r>
-      <w:r/>
-      <w:r/>
-      <w:r>
+      <w:r>
+        <w:rPr/>
+      </w:r>
+      <w:r>
+        <w:rPr/>
+      </w:r>
+      <w:r>
+        <w:rPr/>
         <w:fldChar w:fldCharType="end"/>
       </w:r>
       <w:r>
-        <w:t xml:space="preserve">{% if municipalityHeader %}{{ municipalityHeader}}{% else %}-{% endif %}</w:t>
+        <w:rPr/>
+        <w:t>{% if municipalityHeader %}{{ municipalityHeader}}{% else %}-{% endif %}</w:t>
       </w:r>
     </w:p>
     <w:p>
@@ -1055,28 +1041,39 @@
         <w:rPr>
           <w:b/>
         </w:rPr>
-        <w:t xml:space="preserve">Indirizzo</w:t>
-      </w:r>
-      <w:r>
+        <w:t>Indirizzo</w:t>
+      </w:r>
+      <w:r>
+        <w:rPr/>
         <w:tab/>
       </w:r>
       <w:r>
         <w:fldChar w:fldCharType="begin"/>
       </w:r>
       <w:r>
+        <w:rPr/>
         <w:instrText xml:space="preserve">Test</w:instrText>
       </w:r>
-      <w:r/>
-      <w:r>
+      <w:r>
+        <w:rPr/>
+      </w:r>
+      <w:r>
+        <w:rPr/>
         <w:fldChar w:fldCharType="separate"/>
       </w:r>
-      <w:r/>
-      <w:r/>
-      <w:r>
+      <w:r>
+        <w:rPr/>
+      </w:r>
+      <w:r>
+        <w:rPr/>
+      </w:r>
+      <w:r>
+        <w:rPr/>
         <w:fldChar w:fldCharType="end"/>
       </w:r>
       <w:r>
-        <w:t xml:space="preserve">{% if addressHeader %}{{ addressHeader }}{% else %}-{% endif %}</w:t>
+        <w:rPr/>
+        <w:t>{% if addressHeader %}{{ addressHeader }}{% else %}-{% endif %}</w:t>
       </w:r>
     </w:p>
     <w:p>
@@ -1109,28 +1106,39 @@
         <w:rPr>
           <w:b/>
         </w:rPr>
-        <w:t xml:space="preserve">Particella/e</w:t>
-      </w:r>
-      <w:r>
+        <w:t>Particella/e</w:t>
+      </w:r>
+      <w:r>
+        <w:rPr/>
         <w:tab/>
       </w:r>
       <w:r>
         <w:fldChar w:fldCharType="begin"/>
       </w:r>
       <w:r>
+        <w:rPr/>
         <w:instrText xml:space="preserve">Test</w:instrText>
       </w:r>
-      <w:r/>
-      <w:r>
+      <w:r>
+        <w:rPr/>
+      </w:r>
+      <w:r>
+        <w:rPr/>
         <w:fldChar w:fldCharType="separate"/>
       </w:r>
-      <w:r/>
-      <w:r/>
-      <w:r>
+      <w:r>
+        <w:rPr/>
+      </w:r>
+      <w:r>
+        <w:rPr/>
+      </w:r>
+      <w:r>
+        <w:rPr/>
         <w:fldChar w:fldCharType="end"/>
       </w:r>
       <w:r>
-        <w:t xml:space="preserve">{% if plotsHeader %}{{ plotsHeader }}{% else %}-{% endif %}</w:t>
+        <w:rPr/>
+        <w:t>{% if plotsHeader %}{{ plotsHeader }}{% else %}-{% endif %}</w:t>
       </w:r>
     </w:p>
     <w:p>
@@ -1160,7 +1168,7 @@
           <w:b/>
           <w:sz w:val="30"/>
         </w:rPr>
-        <w:t xml:space="preserve">Documentazione di domanda</w:t>
+        <w:t>Documentazione di domanda</w:t>
       </w:r>
     </w:p>
     <w:p>
@@ -1189,7 +1197,7 @@
           <w:tab w:val="clear" w:pos="709"/>
           <w:tab w:val="left" w:pos="4678" w:leader="none"/>
         </w:tabs>
-        <w:ind w:left="0" w:hanging="0"/>
+        <w:ind w:hanging="0" w:left="0"/>
         <w:rPr>
           <w:rFonts w:ascii="Arial" w:hAnsi="Arial"/>
         </w:rPr>
@@ -1198,34 +1206,53 @@
         <w:fldChar w:fldCharType="begin"/>
       </w:r>
       <w:r>
+        <w:rPr/>
         <w:instrText xml:space="preserve">Test</w:instrText>
       </w:r>
-      <w:r/>
-      <w:r>
+      <w:r>
+        <w:rPr/>
+      </w:r>
+      <w:r>
+        <w:rPr/>
         <w:fldChar w:fldCharType="separate"/>
       </w:r>
-      <w:r/>
-      <w:r/>
-      <w:r>
+      <w:r>
+        <w:rPr/>
+      </w:r>
+      <w:r>
+        <w:rPr/>
+      </w:r>
+      <w:r>
+        <w:rPr/>
         <w:fldChar w:fldCharType="end"/>
       </w:r>
       <w:r>
         <w:fldChar w:fldCharType="begin"/>
       </w:r>
       <w:r>
+        <w:rPr/>
         <w:instrText xml:space="preserve">Test</w:instrText>
       </w:r>
-      <w:r/>
-      <w:r>
+      <w:r>
+        <w:rPr/>
+      </w:r>
+      <w:r>
+        <w:rPr/>
         <w:fldChar w:fldCharType="separate"/>
       </w:r>
-      <w:r/>
-      <w:r/>
-      <w:r>
+      <w:r>
+        <w:rPr/>
+      </w:r>
+      <w:r>
+        <w:rPr/>
+      </w:r>
+      <w:r>
+        <w:rPr/>
         <w:fldChar w:fldCharType="end"/>
       </w:r>
       <w:r>
-        <w:t xml:space="preserve">{% for document in documents %}</w:t>
+        <w:rPr/>
+        <w:t>{% for document in documents %}</w:t>
       </w:r>
     </w:p>
     <w:p>
@@ -1240,10 +1267,12 @@
         </w:rPr>
       </w:pPr>
       <w:r>
-        <w:t xml:space="preserve">    </w:t>
-      </w:r>
-      <w:r>
-        <w:t xml:space="preserve">• {{ document.filename }}, creato il {{ document.date }} alle ore {{ document.time }}</w:t>
+        <w:rPr/>
+        <w:t xml:space="preserve">    • </w:t>
+      </w:r>
+      <w:r>
+        <w:rPr/>
+        <w:t>{{ document.filename }}, creato il {{ document.date }} alle ore {{ document.time }}</w:t>
       </w:r>
     </w:p>
     <w:p>
@@ -1257,13 +1286,14 @@
           <w:tab w:val="clear" w:pos="709"/>
           <w:tab w:val="left" w:pos="4678" w:leader="none"/>
         </w:tabs>
-        <w:ind w:left="0" w:hanging="0"/>
-        <w:rPr>
-          <w:rFonts w:ascii="Arial" w:hAnsi="Arial"/>
-        </w:rPr>
-      </w:pPr>
-      <w:r>
-        <w:t xml:space="preserve">{% endfor %}</w:t>
+        <w:ind w:hanging="0" w:left="0"/>
+        <w:rPr>
+          <w:rFonts w:ascii="Arial" w:hAnsi="Arial"/>
+        </w:rPr>
+      </w:pPr>
+      <w:r>
+        <w:rPr/>
+        <w:t>{% endfor %}</w:t>
       </w:r>
     </w:p>
     <w:p>
@@ -1273,7 +1303,7 @@
         <w:suppressAutoHyphens w:val="true"/>
         <w:bidi w:val="0"/>
         <w:spacing w:before="0" w:after="0"/>
-        <w:ind w:left="0" w:right="0" w:hanging="0"/>
+        <w:ind w:hanging="0" w:left="0" w:right="0"/>
         <w:contextualSpacing/>
         <w:jc w:val="left"/>
         <w:rPr>
@@ -1281,7 +1311,8 @@
         </w:rPr>
       </w:pPr>
       <w:r>
-        <w:t xml:space="preserve">{% if not documents %}</w:t>
+        <w:rPr/>
+        <w:t>{% if not documents %}</w:t>
       </w:r>
     </w:p>
     <w:p>
@@ -1291,7 +1322,7 @@
         <w:suppressAutoHyphens w:val="true"/>
         <w:bidi w:val="0"/>
         <w:spacing w:before="0" w:after="0"/>
-        <w:ind w:left="0" w:right="0" w:hanging="0"/>
+        <w:ind w:hanging="0" w:left="0" w:right="0"/>
         <w:contextualSpacing/>
         <w:jc w:val="left"/>
         <w:rPr>
@@ -1299,7 +1330,8 @@
         </w:rPr>
       </w:pPr>
       <w:r>
-        <w:t xml:space="preserve">-</w:t>
+        <w:rPr/>
+        <w:t>-</w:t>
       </w:r>
     </w:p>
     <w:p>
@@ -1309,7 +1341,7 @@
         <w:suppressAutoHyphens w:val="true"/>
         <w:bidi w:val="0"/>
         <w:spacing w:before="0" w:after="0"/>
-        <w:ind w:left="0" w:right="0" w:hanging="0"/>
+        <w:ind w:hanging="0" w:left="0" w:right="0"/>
         <w:contextualSpacing/>
         <w:jc w:val="left"/>
         <w:rPr>
@@ -1317,7 +1349,8 @@
         </w:rPr>
       </w:pPr>
       <w:r>
-        <w:t xml:space="preserve">{% endif %}</w:t>
+        <w:rPr/>
+        <w:t>{% endif %}</w:t>
       </w:r>
     </w:p>
     <w:p>
@@ -1347,7 +1380,8 @@
         </w:rPr>
       </w:pPr>
       <w:r>
-        <w:t xml:space="preserve">La domanda di costruzione deve essere firmata dalle persone proprietarie del fondo, dalle persone richiedenti e dalle/dai progettiste/i.</w:t>
+        <w:rPr/>
+        <w:t>La domanda di costruzione deve essere firmata dalle persone proprietarie del fondo, dalle persone richiedenti e dalle/dai progettiste/i.</w:t>
       </w:r>
     </w:p>
     <w:p>
@@ -1377,7 +1411,8 @@
         </w:rPr>
       </w:pPr>
       <w:r>
-        <w:t xml:space="preserve">Le persone firmatarie dichiarano di essere d'accordo con il progetto di costruzione, confermano di aver fornito indicazioni complete come pure indicazioni e documenti corretti.</w:t>
+        <w:rPr/>
+        <w:t>Le persone firmatarie dichiarano di essere d'accordo con il progetto di costruzione, confermano di aver fornito indicazioni complete come pure indicazioni e documenti corretti.</w:t>
       </w:r>
     </w:p>
     <w:p>
@@ -1410,7 +1445,7 @@
         <w:rPr>
           <w:sz w:val="21"/>
         </w:rPr>
-        <w:t xml:space="preserve">{% if applicants %}</w:t>
+        <w:t>{% if applicants %}</w:t>
       </w:r>
     </w:p>
     <w:p>
@@ -1428,7 +1463,7 @@
         <w:rPr>
           <w:b/>
         </w:rPr>
-        <w:t xml:space="preserve">Richiedente</w:t>
+        <w:t>Richiedente</w:t>
       </w:r>
     </w:p>
     <w:p>
@@ -1446,7 +1481,7 @@
         <w:rPr>
           <w:sz w:val="21"/>
         </w:rPr>
-        <w:t xml:space="preserve">{% for applicant in applicants %}</w:t>
+        <w:t>{% for applicant in applicants %}</w:t>
       </w:r>
     </w:p>
     <w:p>
@@ -1484,7 +1519,7 @@
         <w:rPr>
           <w:sz w:val="21"/>
         </w:rPr>
-        <w:t xml:space="preserve">{{ applicant.full_name }}</w:t>
+        <w:t>{{ applicant.full_name }}</w:t>
       </w:r>
     </w:p>
     <w:p>
@@ -1519,7 +1554,8 @@
         </w:rPr>
       </w:pPr>
       <w:r>
-        <w:t xml:space="preserve">_ _ _ _ _ _ _ _ _ _ _ _ _ _ _ _ _ _ _ _ _ _ _ _ _</w:t>
+        <w:rPr/>
+        <w:t>_ _ _ _ _ _ _ _ _ _ _ _ _ _ _ _ _ _ _ _ _ _ _ _ _</w:t>
       </w:r>
     </w:p>
     <w:p>
@@ -1553,19 +1589,9 @@
         <w:rPr>
           <w:sz w:val="21"/>
         </w:rPr>
-        <w:t xml:space="preserve">Luogo e data</w:t>
-      </w:r>
-      <w:r>
-        <w:rPr>
-          <w:sz w:val="21"/>
-        </w:rPr>
+        <w:t>Luogo e data</w:t>
         <w:tab/>
-      </w:r>
-      <w:r>
-        <w:rPr>
-          <w:sz w:val="21"/>
-        </w:rPr>
-        <w:t xml:space="preserve">Firma</w:t>
+        <w:t>Firma</w:t>
       </w:r>
     </w:p>
     <w:p>
@@ -1599,7 +1625,7 @@
         <w:rPr>
           <w:sz w:val="21"/>
         </w:rPr>
-        <w:t xml:space="preserve">{% endfor %}</w:t>
+        <w:t>{% endfor %}</w:t>
       </w:r>
     </w:p>
     <w:p>
@@ -1617,7 +1643,7 @@
         <w:rPr>
           <w:sz w:val="21"/>
         </w:rPr>
-        <w:t xml:space="preserve">{% endif %}{% if landowners %}</w:t>
+        <w:t>{% endif %}{% if landowners %}</w:t>
       </w:r>
     </w:p>
     <w:p>
@@ -1635,7 +1661,7 @@
         <w:rPr>
           <w:b/>
         </w:rPr>
-        <w:t xml:space="preserve">Persona proprietaria del fondo</w:t>
+        <w:t>Persona proprietaria del fondo</w:t>
       </w:r>
     </w:p>
     <w:p>
@@ -1653,7 +1679,7 @@
         <w:rPr>
           <w:sz w:val="21"/>
         </w:rPr>
-        <w:t xml:space="preserve">{% for landowner in landowners %}</w:t>
+        <w:t>{% for landowner in landowners %}</w:t>
       </w:r>
     </w:p>
     <w:p>
@@ -1691,7 +1717,7 @@
         <w:rPr>
           <w:sz w:val="21"/>
         </w:rPr>
-        <w:t xml:space="preserve">{{ landowner.full_name }}</w:t>
+        <w:t>{{ landowner.full_name }}</w:t>
       </w:r>
     </w:p>
     <w:p>
@@ -1746,7 +1772,8 @@
         </w:rPr>
       </w:pPr>
       <w:r>
-        <w:t xml:space="preserve">_ _ _ _ _ _ _ _ _ _ _ _ _ _ _ _ _ _ _ _ _ _ _ _ _</w:t>
+        <w:rPr/>
+        <w:t>_ _ _ _ _ _ _ _ _ _ _ _ _ _ _ _ _ _ _ _ _ _ _ _ _</w:t>
       </w:r>
     </w:p>
     <w:p>
@@ -1780,19 +1807,9 @@
         <w:rPr>
           <w:sz w:val="21"/>
         </w:rPr>
-        <w:t xml:space="preserve">Luogo e data</w:t>
-      </w:r>
-      <w:r>
-        <w:rPr>
-          <w:sz w:val="21"/>
-        </w:rPr>
+        <w:t>Luogo e data</w:t>
         <w:tab/>
-      </w:r>
-      <w:r>
-        <w:rPr>
-          <w:sz w:val="21"/>
-        </w:rPr>
-        <w:t xml:space="preserve">Firma</w:t>
+        <w:t>Firma</w:t>
       </w:r>
     </w:p>
     <w:p>
@@ -1826,7 +1843,7 @@
         <w:rPr>
           <w:sz w:val="21"/>
         </w:rPr>
-        <w:t xml:space="preserve">{% endfor %}</w:t>
+        <w:t>{% endfor %}</w:t>
       </w:r>
     </w:p>
     <w:p>
@@ -1844,7 +1861,7 @@
         <w:rPr>
           <w:sz w:val="21"/>
         </w:rPr>
-        <w:t xml:space="preserve">{% endif %}{% if projectAuthors %}</w:t>
+        <w:t>{% endif %}{% if projectAuthors %}</w:t>
       </w:r>
     </w:p>
     <w:p>
@@ -1862,7 +1879,7 @@
         <w:rPr>
           <w:b/>
         </w:rPr>
-        <w:t xml:space="preserve">Progettista</w:t>
+        <w:t>Progettista</w:t>
       </w:r>
     </w:p>
     <w:p>
@@ -1880,7 +1897,7 @@
         <w:rPr>
           <w:sz w:val="21"/>
         </w:rPr>
-        <w:t xml:space="preserve">{% for projectAuthor in projectAuthors %}</w:t>
+        <w:t>{% for projectAuthor in projectAuthors %}</w:t>
       </w:r>
     </w:p>
     <w:p>
@@ -1918,7 +1935,7 @@
         <w:rPr>
           <w:sz w:val="21"/>
         </w:rPr>
-        <w:t xml:space="preserve">{{ projectAuthor.full_name }}</w:t>
+        <w:t>{{ projectAuthor.full_name }}</w:t>
       </w:r>
     </w:p>
     <w:p>
@@ -1973,7 +1990,8 @@
         </w:rPr>
       </w:pPr>
       <w:r>
-        <w:t xml:space="preserve">_ _ _ _ _ _ _ _ _ _ _ _ _ _ _ _ _ _ _ _ _ _ _ _ _</w:t>
+        <w:rPr/>
+        <w:t>_ _ _ _ _ _ _ _ _ _ _ _ _ _ _ _ _ _ _ _ _ _ _ _ _</w:t>
       </w:r>
     </w:p>
     <w:p>
@@ -2007,19 +2025,9 @@
         <w:rPr>
           <w:sz w:val="21"/>
         </w:rPr>
-        <w:t xml:space="preserve">Luogo e data</w:t>
-      </w:r>
-      <w:r>
-        <w:rPr>
-          <w:sz w:val="21"/>
-        </w:rPr>
+        <w:t>Luogo e data</w:t>
         <w:tab/>
-      </w:r>
-      <w:r>
-        <w:rPr>
-          <w:sz w:val="21"/>
-        </w:rPr>
-        <w:t xml:space="preserve">Firma</w:t>
+        <w:t>Firma</w:t>
       </w:r>
     </w:p>
     <w:p>
@@ -2053,7 +2061,7 @@
         <w:rPr>
           <w:sz w:val="21"/>
         </w:rPr>
-        <w:t xml:space="preserve">{% endfor %}</w:t>
+        <w:t>{% endfor %}</w:t>
       </w:r>
     </w:p>
     <w:p>
@@ -2071,7 +2079,7 @@
         <w:rPr>
           <w:sz w:val="21"/>
         </w:rPr>
-        <w:t xml:space="preserve">{% endif %}</w:t>
+        <w:t>{% endif %}</w:t>
       </w:r>
     </w:p>
     <w:p>
@@ -2105,7 +2113,7 @@
           <w:i/>
           <w:sz w:val="19"/>
         </w:rPr>
-        <w:t xml:space="preserve">In casi particolari (ad esempio nel caso di comunioni ereditarie o tutela) una prova della facoltà di disporre sostituisce la firma delle persone proprietarie del fondo.</w:t>
+        <w:t>In casi particolari (ad esempio nel caso di comunioni ereditarie o tutela) una prova della facoltà di disporre sostituisce la firma delle persone proprietarie del fondo.</w:t>
       </w:r>
     </w:p>
     <w:p>
@@ -2139,18 +2147,13 @@
           <w:i/>
           <w:sz w:val="19"/>
         </w:rPr>
-        <w:t xml:space="preserve">La ricevuta stampata e firmata deve essere inoltrata al comune di ubicazione.</w:t>
-      </w:r>
-      <w:r>
-        <w:rPr>
-          <w:i/>
-          <w:sz w:val="19"/>
-        </w:rPr>
-        <w:t xml:space="preserve"> </w:t>
+        <w:t xml:space="preserve">La ricevuta stampata e firmata deve essere inoltrata al comune di ubicazione. </w:t>
       </w:r>
     </w:p>
     <w:sectPr>
-      <w:footerReference w:type="default" r:id="rId3"/>
+      <w:footerReference w:type="even" r:id="rId3"/>
+      <w:footerReference w:type="default" r:id="rId4"/>
+      <w:footerReference w:type="first" r:id="rId5"/>
       <w:type w:val="nextPage"/>
       <w:pgSz w:w="11906" w:h="16838"/>
       <w:pgMar w:left="1417" w:right="1417" w:gutter="0" w:header="0" w:top="1417" w:footer="708" w:bottom="1134"/>
@@ -2164,7 +2167,21 @@
 </file>
 
 <file path=word/footer1.xml><?xml version="1.0" encoding="utf-8"?>
-<w:ftr xmlns:o="urn:schemas-microsoft-com:office:office" xmlns:r="http://schemas.openxmlformats.org/officeDocument/2006/relationships" xmlns:v="urn:schemas-microsoft-com:vml" xmlns:w="http://schemas.openxmlformats.org/wordprocessingml/2006/main" xmlns:w10="urn:schemas-microsoft-com:office:word" xmlns:wp="http://schemas.openxmlformats.org/drawingml/2006/wordprocessingDrawing" xmlns:wps="http://schemas.microsoft.com/office/word/2010/wordprocessingShape" xmlns:wpg="http://schemas.microsoft.com/office/word/2010/wordprocessingGroup" xmlns:mc="http://schemas.openxmlformats.org/markup-compatibility/2006" xmlns:wp14="http://schemas.microsoft.com/office/word/2010/wordprocessingDrawing" xmlns:w14="http://schemas.microsoft.com/office/word/2010/wordml" xmlns:w15="http://schemas.microsoft.com/office/word/2012/wordml" mc:Ignorable="w14 wp14 w15">
+<w:ftr xmlns:o="urn:schemas-microsoft-com:office:office" xmlns:r="http://schemas.openxmlformats.org/officeDocument/2006/relationships" xmlns:v="urn:schemas-microsoft-com:vml" xmlns:w="http://schemas.openxmlformats.org/wordprocessingml/2006/main" xmlns:w10="urn:schemas-microsoft-com:office:word" xmlns:wp="http://schemas.openxmlformats.org/drawingml/2006/wordprocessingDrawing" xmlns:pic="http://schemas.openxmlformats.org/drawingml/2006/picture" xmlns:wps="http://schemas.microsoft.com/office/word/2010/wordprocessingShape" xmlns:wpg="http://schemas.microsoft.com/office/word/2010/wordprocessingGroup" xmlns:mc="http://schemas.openxmlformats.org/markup-compatibility/2006" xmlns:wp14="http://schemas.microsoft.com/office/word/2010/wordprocessingDrawing" xmlns:w14="http://schemas.microsoft.com/office/word/2010/wordml" xmlns:w15="http://schemas.microsoft.com/office/word/2012/wordml" mc:Ignorable="w14 wp14 w15">
+  <w:p>
+    <w:pPr>
+      <w:pStyle w:val="Footer"/>
+      <w:rPr/>
+    </w:pPr>
+    <w:r>
+      <w:rPr/>
+    </w:r>
+  </w:p>
+</w:ftr>
+</file>
+
+<file path=word/footer2.xml><?xml version="1.0" encoding="utf-8"?>
+<w:ftr xmlns:o="urn:schemas-microsoft-com:office:office" xmlns:r="http://schemas.openxmlformats.org/officeDocument/2006/relationships" xmlns:v="urn:schemas-microsoft-com:vml" xmlns:w="http://schemas.openxmlformats.org/wordprocessingml/2006/main" xmlns:w10="urn:schemas-microsoft-com:office:word" xmlns:wp="http://schemas.openxmlformats.org/drawingml/2006/wordprocessingDrawing" xmlns:pic="http://schemas.openxmlformats.org/drawingml/2006/picture" xmlns:wps="http://schemas.microsoft.com/office/word/2010/wordprocessingShape" xmlns:wpg="http://schemas.microsoft.com/office/word/2010/wordprocessingGroup" xmlns:mc="http://schemas.openxmlformats.org/markup-compatibility/2006" xmlns:wp14="http://schemas.microsoft.com/office/word/2010/wordprocessingDrawing" xmlns:w14="http://schemas.microsoft.com/office/word/2010/wordml" xmlns:w15="http://schemas.microsoft.com/office/word/2012/wordml" mc:Ignorable="w14 wp14 w15">
   <w:sdt>
     <w:sdtPr>
       <w:docPartObj>
@@ -2222,12 +2239,12 @@
           <w:rPr>
             <w:sz w:val="16"/>
           </w:rPr>
-          <w:t xml:space="preserve">N. dossier {{ dossierNr }}</w:t>
-        </w:r>
-        <w:r>
-          <w:rPr>
-            <w:sz w:val="16"/>
+          <w:t>N. dossier {{ dossierNr }}</w:t>
+        </w:r>
+        <w:r>
+          <w:rPr>
             <w:b/>
+            <w:sz w:val="16"/>
           </w:rPr>
           <w:tab/>
         </w:r>
@@ -2235,12 +2252,12 @@
           <w:rPr>
             <w:sz w:val="16"/>
           </w:rPr>
-          <w:t xml:space="preserve">{{ uploadedAt }}</w:t>
-        </w:r>
-        <w:r>
-          <w:rPr>
-            <w:sz w:val="16"/>
+          <w:t>{{ uploadedAt }}</w:t>
+        </w:r>
+        <w:r>
+          <w:rPr>
             <w:b/>
+            <w:sz w:val="16"/>
           </w:rPr>
           <w:tab/>
         </w:r>
@@ -2296,7 +2313,176 @@
             <w:b/>
             <w:sz w:val="16"/>
           </w:rPr>
-          <w:fldChar w:fldCharType="begin" w:dirty="true"/>
+          <w:fldChar w:fldCharType="begin"/>
+        </w:r>
+        <w:r>
+          <w:rPr>
+            <w:sz w:val="16"/>
+            <w:b/>
+          </w:rPr>
+          <w:instrText xml:space="preserve"> NUMPAGES </w:instrText>
+        </w:r>
+        <w:r>
+          <w:rPr>
+            <w:sz w:val="16"/>
+            <w:b/>
+          </w:rPr>
+          <w:fldChar w:fldCharType="separate"/>
+        </w:r>
+        <w:r>
+          <w:rPr>
+            <w:sz w:val="16"/>
+            <w:b/>
+          </w:rPr>
+          <w:t>2</w:t>
+        </w:r>
+        <w:r>
+          <w:rPr>
+            <w:sz w:val="16"/>
+            <w:b/>
+          </w:rPr>
+          <w:fldChar w:fldCharType="end"/>
+        </w:r>
+      </w:p>
+    </w:sdtContent>
+  </w:sdt>
+</w:ftr>
+</file>
+
+<file path=word/footer3.xml><?xml version="1.0" encoding="utf-8"?>
+<w:ftr xmlns:o="urn:schemas-microsoft-com:office:office" xmlns:r="http://schemas.openxmlformats.org/officeDocument/2006/relationships" xmlns:v="urn:schemas-microsoft-com:vml" xmlns:w="http://schemas.openxmlformats.org/wordprocessingml/2006/main" xmlns:w10="urn:schemas-microsoft-com:office:word" xmlns:wp="http://schemas.openxmlformats.org/drawingml/2006/wordprocessingDrawing" xmlns:pic="http://schemas.openxmlformats.org/drawingml/2006/picture" xmlns:wps="http://schemas.microsoft.com/office/word/2010/wordprocessingShape" xmlns:wpg="http://schemas.microsoft.com/office/word/2010/wordprocessingGroup" xmlns:mc="http://schemas.openxmlformats.org/markup-compatibility/2006" xmlns:wp14="http://schemas.microsoft.com/office/word/2010/wordprocessingDrawing" xmlns:w14="http://schemas.microsoft.com/office/word/2010/wordml" xmlns:w15="http://schemas.microsoft.com/office/word/2012/wordml" mc:Ignorable="w14 wp14 w15">
+  <w:sdt>
+    <w:sdtPr>
+      <w:docPartObj>
+        <w:docPartGallery w:val="Page Numbers (Top of Page)"/>
+        <w:docPartUnique w:val="true"/>
+      </w:docPartObj>
+      <w:id w:val="716730522"/>
+    </w:sdtPr>
+    <w:sdtContent>
+      <w:p>
+        <w:pPr>
+          <w:pStyle w:val="Footer"/>
+          <w:rPr>
+            <w:sz w:val="16"/>
+            <w:szCs w:val="16"/>
+          </w:rPr>
+        </w:pPr>
+        <w:r>
+          <w:fldChar w:fldCharType="begin"/>
+        </w:r>
+        <w:r>
+          <w:rPr>
+            <w:sz w:val="16"/>
+          </w:rPr>
+          <w:instrText xml:space="preserve">Test</w:instrText>
+        </w:r>
+        <w:r>
+          <w:rPr>
+            <w:sz w:val="16"/>
+          </w:rPr>
+        </w:r>
+        <w:r>
+          <w:rPr>
+            <w:sz w:val="16"/>
+          </w:rPr>
+          <w:fldChar w:fldCharType="separate"/>
+        </w:r>
+        <w:r>
+          <w:rPr>
+            <w:sz w:val="16"/>
+          </w:rPr>
+        </w:r>
+        <w:r>
+          <w:rPr>
+            <w:sz w:val="16"/>
+          </w:rPr>
+        </w:r>
+        <w:r>
+          <w:rPr>
+            <w:sz w:val="16"/>
+          </w:rPr>
+          <w:fldChar w:fldCharType="end"/>
+        </w:r>
+        <w:r>
+          <w:rPr>
+            <w:sz w:val="16"/>
+          </w:rPr>
+          <w:t>N. dossier {{ dossierNr }}</w:t>
+        </w:r>
+        <w:r>
+          <w:rPr>
+            <w:b/>
+            <w:sz w:val="16"/>
+          </w:rPr>
+          <w:tab/>
+        </w:r>
+        <w:r>
+          <w:rPr>
+            <w:sz w:val="16"/>
+          </w:rPr>
+          <w:t>{{ uploadedAt }}</w:t>
+        </w:r>
+        <w:r>
+          <w:rPr>
+            <w:b/>
+            <w:sz w:val="16"/>
+          </w:rPr>
+          <w:tab/>
+        </w:r>
+        <w:r>
+          <w:rPr>
+            <w:sz w:val="16"/>
+          </w:rPr>
+          <w:t xml:space="preserve">pagina </w:t>
+        </w:r>
+        <w:r>
+          <w:rPr>
+            <w:b/>
+            <w:sz w:val="16"/>
+          </w:rPr>
+          <w:fldChar w:fldCharType="begin"/>
+        </w:r>
+        <w:r>
+          <w:rPr>
+            <w:sz w:val="16"/>
+            <w:b/>
+          </w:rPr>
+          <w:instrText xml:space="preserve"> PAGE </w:instrText>
+        </w:r>
+        <w:r>
+          <w:rPr>
+            <w:sz w:val="16"/>
+            <w:b/>
+          </w:rPr>
+          <w:fldChar w:fldCharType="separate"/>
+        </w:r>
+        <w:r>
+          <w:rPr>
+            <w:sz w:val="16"/>
+            <w:b/>
+          </w:rPr>
+          <w:t>2</w:t>
+        </w:r>
+        <w:r>
+          <w:rPr>
+            <w:sz w:val="16"/>
+            <w:b/>
+          </w:rPr>
+          <w:fldChar w:fldCharType="end"/>
+        </w:r>
+        <w:r>
+          <w:rPr>
+            <w:sz w:val="16"/>
+          </w:rPr>
+          <w:t xml:space="preserve"> di </w:t>
+        </w:r>
+        <w:r>
+          <w:rPr>
+            <w:b/>
+            <w:sz w:val="16"/>
+          </w:rPr>
+          <w:fldChar w:fldCharType="begin"/>
         </w:r>
         <w:r>
           <w:rPr>
@@ -2750,7 +2936,7 @@
     <w:qFormat/>
     <w:rPr/>
   </w:style>
-  <w:style w:type="character" w:styleId="Annotationreference">
+  <w:style w:type="character" w:styleId="CommentReference">
     <w:name w:val="annotation reference"/>
     <w:basedOn w:val="DefaultParagraphFont"/>
     <w:uiPriority w:val="99"/>
@@ -2766,7 +2952,7 @@
   <w:style w:type="character" w:styleId="KommentartextZchn" w:customStyle="1">
     <w:name w:val="Kommentartext Zchn"/>
     <w:basedOn w:val="DefaultParagraphFont"/>
-    <w:link w:val="Annotationtext"/>
+    <w:link w:val="CommentText"/>
     <w:uiPriority w:val="99"/>
     <w:semiHidden/>
     <w:qFormat/>
@@ -2779,7 +2965,7 @@
   <w:style w:type="character" w:styleId="KommentarthemaZchn" w:customStyle="1">
     <w:name w:val="Kommentarthema Zchn"/>
     <w:basedOn w:val="KommentartextZchn"/>
-    <w:link w:val="Annotationsubject"/>
+    <w:link w:val="annotationsubject"/>
     <w:uiPriority w:val="99"/>
     <w:semiHidden/>
     <w:qFormat/>
@@ -2805,7 +2991,7 @@
       <w:szCs w:val="18"/>
     </w:rPr>
   </w:style>
-  <w:style w:type="character" w:styleId="InternetLink">
+  <w:style w:type="character" w:styleId="Hyperlink">
     <w:name w:val="Hyperlink"/>
     <w:basedOn w:val="DefaultParagraphFont"/>
     <w:uiPriority w:val="99"/>
@@ -2817,7 +3003,7 @@
       <w:u w:val="single"/>
     </w:rPr>
   </w:style>
-  <w:style w:type="character" w:styleId="VisitedInternetLink">
+  <w:style w:type="character" w:styleId="FollowedHyperlink">
     <w:name w:val="FollowedHyperlink"/>
     <w:basedOn w:val="DefaultParagraphFont"/>
     <w:uiPriority w:val="99"/>
@@ -2825,7 +3011,7 @@
     <w:unhideWhenUsed/>
     <w:rsid w:val="00490257"/>
     <w:rPr>
-      <w:color w:val="954F72" w:themeColor="followedHyperlink"/>
+      <w:color w:themeColor="followedHyperlink" w:val="954F72"/>
       <w:u w:val="single"/>
     </w:rPr>
   </w:style>
@@ -2857,7 +3043,7 @@
   <w:style w:type="paragraph" w:styleId="Heading">
     <w:name w:val="Heading"/>
     <w:basedOn w:val="Normal"/>
-    <w:next w:val="TextBody"/>
+    <w:next w:val="BodyText"/>
     <w:qFormat/>
     <w:pPr>
       <w:keepNext w:val="true"/>
@@ -2869,7 +3055,7 @@
       <w:szCs w:val="28"/>
     </w:rPr>
   </w:style>
-  <w:style w:type="paragraph" w:styleId="TextBody">
+  <w:style w:type="paragraph" w:styleId="BodyText">
     <w:name w:val="Body Text"/>
     <w:basedOn w:val="Normal"/>
     <w:pPr>
@@ -2879,14 +3065,14 @@
   </w:style>
   <w:style w:type="paragraph" w:styleId="List">
     <w:name w:val="List"/>
-    <w:basedOn w:val="TextBody"/>
+    <w:basedOn w:val="BodyText"/>
     <w:pPr/>
     <w:rPr>
       <w:rFonts w:cs="Lohit Devanagari"/>
     </w:rPr>
   </w:style>
   <w:style w:type="paragraph" w:styleId="Caption">
-    <w:name w:val="Caption"/>
+    <w:name w:val="caption"/>
     <w:basedOn w:val="Normal"/>
     <w:qFormat/>
     <w:pPr>
@@ -2912,7 +3098,7 @@
       <w:rFonts w:cs="Lohit Devanagari"/>
     </w:rPr>
   </w:style>
-  <w:style w:type="paragraph" w:styleId="Annotationtext">
+  <w:style w:type="paragraph" w:styleId="CommentText">
     <w:name w:val="annotation text"/>
     <w:basedOn w:val="Normal"/>
     <w:link w:val="KommentartextZchn"/>
@@ -2927,10 +3113,10 @@
       <w:szCs w:val="20"/>
     </w:rPr>
   </w:style>
-  <w:style w:type="paragraph" w:styleId="Annotationsubject">
+  <w:style w:type="paragraph" w:styleId="annotationsubject">
     <w:name w:val="annotation subject"/>
-    <w:basedOn w:val="Annotationtext"/>
-    <w:next w:val="Annotationtext"/>
+    <w:basedOn w:val="CommentText"/>
+    <w:next w:val="CommentText"/>
     <w:link w:val="KommentarthemaZchn"/>
     <w:uiPriority w:val="99"/>
     <w:semiHidden/>
@@ -2967,7 +3153,7 @@
     <w:rPr/>
   </w:style>
   <w:style w:type="paragraph" w:styleId="Header">
-    <w:name w:val="Header"/>
+    <w:name w:val="header"/>
     <w:basedOn w:val="Normal"/>
     <w:link w:val="KopfzeileZchn"/>
     <w:uiPriority w:val="99"/>
@@ -2983,7 +3169,7 @@
     <w:rPr/>
   </w:style>
   <w:style w:type="paragraph" w:styleId="Footer">
-    <w:name w:val="Footer"/>
+    <w:name w:val="footer"/>
     <w:basedOn w:val="Normal"/>
     <w:link w:val="FuzeileZchn"/>
     <w:uiPriority w:val="99"/>
@@ -3006,13 +3192,13 @@
     <w:rsid w:val="0060264b"/>
     <w:pPr>
       <w:spacing w:before="0" w:after="0"/>
-      <w:ind w:left="720" w:hanging="0"/>
+      <w:ind w:hanging="0" w:left="720"/>
       <w:contextualSpacing/>
     </w:pPr>
     <w:rPr/>
   </w:style>
-  <w:style w:type="paragraph" w:styleId="FrameContents">
-    <w:name w:val="Frame Contents"/>
+  <w:style w:type="paragraph" w:styleId="FrameContentsuser">
+    <w:name w:val="Frame Contents (user)"/>
     <w:basedOn w:val="Normal"/>
     <w:qFormat/>
     <w:pPr/>
@@ -3043,161 +3229,97 @@
 </file>
 
 <file path=word/theme/theme1.xml><?xml version="1.0" encoding="utf-8"?>
-<a:theme xmlns:a="http://schemas.openxmlformats.org/drawingml/2006/main" name="Office">
+<a:theme xmlns:a="http://schemas.openxmlformats.org/drawingml/2006/main" xmlns:r="http://schemas.openxmlformats.org/officeDocument/2006/relationships" name="Office">
   <a:themeElements>
     <a:clrScheme name="Office">
       <a:dk1>
-        <a:sysClr val="windowText" lastClr="000000"/>
+        <a:srgbClr val="000000"/>
       </a:dk1>
       <a:lt1>
-        <a:sysClr val="window" lastClr="FFFFFF"/>
+        <a:srgbClr val="ffffff"/>
       </a:lt1>
       <a:dk2>
-        <a:srgbClr val="44546A"/>
+        <a:srgbClr val="44546a"/>
       </a:dk2>
       <a:lt2>
-        <a:srgbClr val="E7E6E6"/>
+        <a:srgbClr val="e7e6e6"/>
       </a:lt2>
       <a:accent1>
-        <a:srgbClr val="5B9BD5"/>
+        <a:srgbClr val="5b9bd5"/>
       </a:accent1>
       <a:accent2>
-        <a:srgbClr val="ED7D31"/>
+        <a:srgbClr val="ed7d31"/>
       </a:accent2>
       <a:accent3>
-        <a:srgbClr val="A5A5A5"/>
+        <a:srgbClr val="a5a5a5"/>
       </a:accent3>
       <a:accent4>
-        <a:srgbClr val="FFC000"/>
+        <a:srgbClr val="ffc000"/>
       </a:accent4>
       <a:accent5>
-        <a:srgbClr val="4472C4"/>
+        <a:srgbClr val="4472c4"/>
       </a:accent5>
       <a:accent6>
-        <a:srgbClr val="70AD47"/>
+        <a:srgbClr val="70ad47"/>
       </a:accent6>
       <a:hlink>
-        <a:srgbClr val="0563C1"/>
+        <a:srgbClr val="0563c1"/>
       </a:hlink>
       <a:folHlink>
-        <a:srgbClr val="954F72"/>
+        <a:srgbClr val="954f72"/>
       </a:folHlink>
     </a:clrScheme>
     <a:fontScheme name="Office">
       <a:majorFont>
-        <a:latin typeface="Calibri Light" panose="020F0302020204030204"/>
+        <a:latin typeface="Calibri Light" panose="020F0302020204030204" pitchFamily="0" charset="1"/>
         <a:ea typeface=""/>
         <a:cs typeface=""/>
-        <a:font script="Jpan" typeface="游ゴシック Light"/>
-        <a:font script="Hang" typeface="맑은 고딕"/>
-        <a:font script="Hans" typeface="等线 Light"/>
-        <a:font script="Hant" typeface="新細明體"/>
-        <a:font script="Arab" typeface="Times New Roman"/>
-        <a:font script="Hebr" typeface="Times New Roman"/>
-        <a:font script="Thai" typeface="Angsana New"/>
-        <a:font script="Ethi" typeface="Nyala"/>
-        <a:font script="Beng" typeface="Vrinda"/>
-        <a:font script="Gujr" typeface="Shruti"/>
-        <a:font script="Khmr" typeface="MoolBoran"/>
-        <a:font script="Knda" typeface="Tunga"/>
-        <a:font script="Guru" typeface="Raavi"/>
-        <a:font script="Cans" typeface="Euphemia"/>
-        <a:font script="Cher" typeface="Plantagenet Cherokee"/>
-        <a:font script="Yiii" typeface="Microsoft Yi Baiti"/>
-        <a:font script="Tibt" typeface="Microsoft Himalaya"/>
-        <a:font script="Thaa" typeface="MV Boli"/>
-        <a:font script="Deva" typeface="Mangal"/>
-        <a:font script="Telu" typeface="Gautami"/>
-        <a:font script="Taml" typeface="Latha"/>
-        <a:font script="Syrc" typeface="Estrangelo Edessa"/>
-        <a:font script="Orya" typeface="Kalinga"/>
-        <a:font script="Mlym" typeface="Kartika"/>
-        <a:font script="Laoo" typeface="DokChampa"/>
-        <a:font script="Sinh" typeface="Iskoola Pota"/>
-        <a:font script="Mong" typeface="Mongolian Baiti"/>
-        <a:font script="Viet" typeface="Times New Roman"/>
-        <a:font script="Uigh" typeface="Microsoft Uighur"/>
-        <a:font script="Geor" typeface="Sylfaen"/>
       </a:majorFont>
       <a:minorFont>
-        <a:latin typeface="Calibri" panose="020F0502020204030204"/>
+        <a:latin typeface="Calibri" panose="020F0502020204030204" pitchFamily="0" charset="1"/>
         <a:ea typeface=""/>
         <a:cs typeface=""/>
-        <a:font script="Jpan" typeface="游明朝"/>
-        <a:font script="Hang" typeface="맑은 고딕"/>
-        <a:font script="Hans" typeface="等线"/>
-        <a:font script="Hant" typeface="新細明體"/>
-        <a:font script="Arab" typeface="Arial"/>
-        <a:font script="Hebr" typeface="Arial"/>
-        <a:font script="Thai" typeface="Cordia New"/>
-        <a:font script="Ethi" typeface="Nyala"/>
-        <a:font script="Beng" typeface="Vrinda"/>
-        <a:font script="Gujr" typeface="Shruti"/>
-        <a:font script="Khmr" typeface="DaunPenh"/>
-        <a:font script="Knda" typeface="Tunga"/>
-        <a:font script="Guru" typeface="Raavi"/>
-        <a:font script="Cans" typeface="Euphemia"/>
-        <a:font script="Cher" typeface="Plantagenet Cherokee"/>
-        <a:font script="Yiii" typeface="Microsoft Yi Baiti"/>
-        <a:font script="Tibt" typeface="Microsoft Himalaya"/>
-        <a:font script="Thaa" typeface="MV Boli"/>
-        <a:font script="Deva" typeface="Mangal"/>
-        <a:font script="Telu" typeface="Gautami"/>
-        <a:font script="Taml" typeface="Latha"/>
-        <a:font script="Syrc" typeface="Estrangelo Edessa"/>
-        <a:font script="Orya" typeface="Kalinga"/>
-        <a:font script="Mlym" typeface="Kartika"/>
-        <a:font script="Laoo" typeface="DokChampa"/>
-        <a:font script="Sinh" typeface="Iskoola Pota"/>
-        <a:font script="Mong" typeface="Mongolian Baiti"/>
-        <a:font script="Viet" typeface="Arial"/>
-        <a:font script="Uigh" typeface="Microsoft Uighur"/>
-        <a:font script="Geor" typeface="Sylfaen"/>
       </a:minorFont>
     </a:fontScheme>
-    <a:fmtScheme name="Office">
+    <a:fmtScheme>
       <a:fillStyleLst>
         <a:solidFill>
           <a:schemeClr val="phClr"/>
         </a:solidFill>
-        <a:gradFill rotWithShape="1">
+        <a:gradFill>
           <a:gsLst>
             <a:gs pos="0">
               <a:schemeClr val="phClr">
                 <a:lumMod val="110000"/>
-                <a:satMod val="105000"/>
                 <a:tint val="67000"/>
               </a:schemeClr>
             </a:gs>
             <a:gs pos="50000">
               <a:schemeClr val="phClr">
                 <a:lumMod val="105000"/>
-                <a:satMod val="103000"/>
                 <a:tint val="73000"/>
               </a:schemeClr>
             </a:gs>
             <a:gs pos="100000">
               <a:schemeClr val="phClr">
                 <a:lumMod val="105000"/>
-                <a:satMod val="109000"/>
                 <a:tint val="81000"/>
               </a:schemeClr>
             </a:gs>
           </a:gsLst>
           <a:lin ang="5400000" scaled="0"/>
+          <a:tileRect l="0" t="0" r="0" b="0"/>
         </a:gradFill>
-        <a:gradFill rotWithShape="1">
+        <a:gradFill>
           <a:gsLst>
             <a:gs pos="0">
               <a:schemeClr val="phClr">
-                <a:satMod val="103000"/>
                 <a:lumMod val="102000"/>
                 <a:tint val="94000"/>
               </a:schemeClr>
             </a:gs>
             <a:gs pos="50000">
               <a:schemeClr val="phClr">
-                <a:satMod val="110000"/>
                 <a:lumMod val="100000"/>
                 <a:shade val="100000"/>
               </a:schemeClr>
@@ -3205,33 +3327,24 @@
             <a:gs pos="100000">
               <a:schemeClr val="phClr">
                 <a:lumMod val="99000"/>
-                <a:satMod val="120000"/>
                 <a:shade val="78000"/>
               </a:schemeClr>
             </a:gs>
           </a:gsLst>
           <a:lin ang="5400000" scaled="0"/>
+          <a:tileRect l="0" t="0" r="0" b="0"/>
         </a:gradFill>
       </a:fillStyleLst>
       <a:lnStyleLst>
         <a:ln w="6350" cap="flat" cmpd="sng" algn="ctr">
-          <a:solidFill>
-            <a:schemeClr val="phClr"/>
-          </a:solidFill>
           <a:prstDash val="solid"/>
           <a:miter lim="800000"/>
         </a:ln>
         <a:ln w="12700" cap="flat" cmpd="sng" algn="ctr">
-          <a:solidFill>
-            <a:schemeClr val="phClr"/>
-          </a:solidFill>
           <a:prstDash val="solid"/>
           <a:miter lim="800000"/>
         </a:ln>
         <a:ln w="19050" cap="flat" cmpd="sng" algn="ctr">
-          <a:solidFill>
-            <a:schemeClr val="phClr"/>
-          </a:solidFill>
           <a:prstDash val="solid"/>
           <a:miter lim="800000"/>
         </a:ln>
@@ -3244,13 +3357,7 @@
           <a:effectLst/>
         </a:effectStyle>
         <a:effectStyle>
-          <a:effectLst>
-            <a:outerShdw blurRad="57150" dist="19050" dir="5400000" algn="ctr" rotWithShape="0">
-              <a:srgbClr val="000000">
-                <a:alpha val="63000"/>
-              </a:srgbClr>
-            </a:outerShdw>
-          </a:effectLst>
+          <a:effectLst/>
         </a:effectStyle>
       </a:effectStyleLst>
       <a:bgFillStyleLst>
@@ -3260,15 +3367,13 @@
         <a:solidFill>
           <a:schemeClr val="phClr">
             <a:tint val="95000"/>
-            <a:satMod val="170000"/>
           </a:schemeClr>
         </a:solidFill>
-        <a:gradFill rotWithShape="1">
+        <a:gradFill>
           <a:gsLst>
             <a:gs pos="0">
               <a:schemeClr val="phClr">
                 <a:tint val="93000"/>
-                <a:satMod val="150000"/>
                 <a:shade val="98000"/>
                 <a:lumMod val="102000"/>
               </a:schemeClr>
@@ -3276,7 +3381,6 @@
             <a:gs pos="50000">
               <a:schemeClr val="phClr">
                 <a:tint val="98000"/>
-                <a:satMod val="130000"/>
                 <a:shade val="90000"/>
                 <a:lumMod val="103000"/>
               </a:schemeClr>
@@ -3284,21 +3388,14 @@
             <a:gs pos="100000">
               <a:schemeClr val="phClr">
                 <a:shade val="63000"/>
-                <a:satMod val="120000"/>
               </a:schemeClr>
             </a:gs>
           </a:gsLst>
           <a:lin ang="5400000" scaled="0"/>
+          <a:tileRect l="0" t="0" r="0" b="0"/>
         </a:gradFill>
       </a:bgFillStyleLst>
     </a:fmtScheme>
   </a:themeElements>
-  <a:objectDefaults/>
-  <a:extraClrSchemeLst/>
-  <a:extLst>
-    <a:ext uri="{05A4C25C-085E-4340-85A3-A5531E510DB2}">
-      <thm15:themeFamily xmlns:thm15="http://schemas.microsoft.com/office/thememl/2012/main" name="Office Theme" id="{62F939B6-93AF-4DB8-9C6B-D6C7DFDC589F}" vid="{4A3C46E8-61CC-4603-A589-7422A47A8E4A}"/>
-    </a:ext>
-  </a:extLst>
 </a:theme>
 </file>
</xml_diff>

<commit_message>
feat(gr): municipality specific content in eingabequittung
</commit_message>
<xml_diff>
--- a/document-merge-service/kt_gr/templatefiles/eingabequittung_it.docx
+++ b/document-merge-service/kt_gr/templatefiles/eingabequittung_it.docx
@@ -2150,6 +2150,96 @@
         <w:t xml:space="preserve">La ricevuta stampata e firmata deve essere inoltrata al comune di ubicazione. </w:t>
       </w:r>
     </w:p>
+    <w:p>
+      <w:pPr>
+        <w:pStyle w:val="Normal"/>
+        <w:tabs>
+          <w:tab w:val="clear" w:pos="709"/>
+          <w:tab w:val="left" w:pos="4678" w:leader="none"/>
+        </w:tabs>
+        <w:rPr>
+          <w:rFonts w:ascii="Arial" w:hAnsi="Arial"/>
+        </w:rPr>
+      </w:pPr>
+      <w:r>
+        <w:rPr/>
+      </w:r>
+      <w:r>
+        <w:br w:type="page"/>
+      </w:r>
+    </w:p>
+    <w:p>
+      <w:pPr>
+        <w:pStyle w:val="BodyText"/>
+        <w:spacing w:before="0" w:after="0"/>
+        <w:rPr/>
+      </w:pPr>
+      <w:r>
+        <w:rPr/>
+        <w:t>{% if municipalityServiceContent %}</w:t>
+      </w:r>
+    </w:p>
+    <w:p>
+      <w:pPr>
+        <w:pStyle w:val="Normal"/>
+        <w:rPr/>
+      </w:pPr>
+      <w:r>
+        <w:rPr/>
+        <w:t>Si prega di osservare le seguenti direttive e informazioni specifiche del comune:</w:t>
+      </w:r>
+    </w:p>
+    <w:p>
+      <w:pPr>
+        <w:pStyle w:val="BodyText"/>
+        <w:widowControl/>
+        <w:pBdr>
+          <w:left w:val="single" w:sz="18" w:space="1" w:color="F0506E"/>
+        </w:pBdr>
+        <w:shd w:val="clear" w:fill="F8F8F8"/>
+        <w:spacing w:lineRule="auto" w:line="240" w:before="144" w:after="0"/>
+        <w:ind w:hanging="86" w:left="360" w:right="0"/>
+        <w:jc w:val="left"/>
+        <w:rPr>
+          <w:sz w:val="22"/>
+        </w:rPr>
+      </w:pPr>
+      <w:r>
+        <w:rPr>
+          <w:sz w:val="22"/>
+        </w:rPr>
+        <w:br w:type="textWrapping" w:clear="all"/>
+      </w:r>
+      <w:r>
+        <w:rPr>
+          <w:sz w:val="22"/>
+        </w:rPr>
+        <w:t>{{municipalityServiceContent}}</w:t>
+        <w:br/>
+      </w:r>
+    </w:p>
+    <w:p>
+      <w:pPr>
+        <w:pStyle w:val="BodyText"/>
+        <w:spacing w:lineRule="auto" w:line="240" w:before="0" w:after="0"/>
+        <w:ind w:hanging="0" w:left="0" w:right="0"/>
+        <w:rPr/>
+      </w:pPr>
+      <w:r>
+        <w:rPr/>
+        <w:t>{% endif %}</w:t>
+      </w:r>
+    </w:p>
+    <w:p>
+      <w:pPr>
+        <w:pStyle w:val="BodyText"/>
+        <w:spacing w:before="0" w:after="140"/>
+        <w:rPr/>
+      </w:pPr>
+      <w:r>
+        <w:rPr/>
+      </w:r>
+    </w:p>
     <w:sectPr>
       <w:footerReference w:type="even" r:id="rId3"/>
       <w:footerReference w:type="default" r:id="rId4"/>
@@ -2293,7 +2383,7 @@
             <w:sz w:val="16"/>
             <w:b/>
           </w:rPr>
-          <w:t>2</w:t>
+          <w:t>1</w:t>
         </w:r>
         <w:r>
           <w:rPr>
@@ -2334,7 +2424,7 @@
             <w:sz w:val="16"/>
             <w:b/>
           </w:rPr>
-          <w:t>2</w:t>
+          <w:t>3</w:t>
         </w:r>
         <w:r>
           <w:rPr>
@@ -2462,7 +2552,7 @@
             <w:sz w:val="16"/>
             <w:b/>
           </w:rPr>
-          <w:t>2</w:t>
+          <w:t>1</w:t>
         </w:r>
         <w:r>
           <w:rPr>
@@ -2503,7 +2593,7 @@
             <w:sz w:val="16"/>
             <w:b/>
           </w:rPr>
-          <w:t>2</w:t>
+          <w:t>3</w:t>
         </w:r>
         <w:r>
           <w:rPr>
@@ -3197,8 +3287,8 @@
     </w:pPr>
     <w:rPr/>
   </w:style>
-  <w:style w:type="paragraph" w:styleId="FrameContentsuser">
-    <w:name w:val="Frame Contents (user)"/>
+  <w:style w:type="paragraph" w:styleId="FrameContents">
+    <w:name w:val="Frame Contents"/>
     <w:basedOn w:val="Normal"/>
     <w:qFormat/>
     <w:pPr/>

</xml_diff>